<commit_message>
Complete student details in practical 13 report
</commit_message>
<xml_diff>
--- a/pract-13-awdf-24cs011.docx
+++ b/pract-13-awdf-24cs011.docx
@@ -514,6 +514,27 @@
                 <w:szCs w:val="24"/>
               </w:rPr>
               <w:t>2026-27</w:t>
+            </w:r>
+          </w:p>
+        </w:tc>
+      </w:tr>
+      <w:tr>
+        <w:tc>
+          <w:tcPr>
+            <w:tcW w:type="dxa" w:w="10005"/>
+            <w:gridSpan w:val="7"/>
+          </w:tcPr>
+          <w:p>
+            <w:pPr>
+              <w:spacing w:before="0" w:after="0"/>
+            </w:pPr>
+            <w:r>
+              <w:rPr>
+                <w:sz w:val="18"/>
+              </w:rPr>
+              <w:t>Email: 24cs011@charusat.edu.in   |   Semester: 5th</w:t>
+              <w:br/>
+              <w:t>Degree: B.Tech   |   Department: CSE   |   Institute: CSPIT</w:t>
             </w:r>
           </w:p>
         </w:tc>

</xml_diff>